<commit_message>
Add images from Wikimedia Commons, fill in image references
Co-Authored-By: Claude Sonnet 5.5 <noreply@anthropic.com>
Claude-Session: https://claude.ai/code/session_01Dueem4NQ1jgAsupYtnRLLZ
</commit_message>
<xml_diff>
--- a/docs/Planning_Document_u3344415.docx
+++ b/docs/Planning_Document_u3344415.docx
@@ -578,7 +578,7 @@
     </w:p>
     <w:p>
       <w:r>
-        <w:t>Images (fill in the photographer, year, title, URL and date for each picture used):</w:t>
+        <w:t>Images:</w:t>
       </w:r>
     </w:p>
     <w:p>
@@ -586,7 +586,7 @@
         <w:pStyle w:val="ListBullet"/>
       </w:pPr>
       <w:r>
-        <w:t>[Photographer] ([year]) [Title] [Photograph]. Available at: [URL] (Accessed: [date]). Used as: banner.jpg</w:t>
+        <w:t>Chavez, G. (2018) Turntable on vintage chest standing on mat [Photograph]. Wikimedia Commons. Available at: https://commons.wikimedia.org/wiki/File:Turntable_On_Vintage_Chest_Standing_On_Matt_(247221445).jpeg (Accessed: 15 October 2026). Licence: CC BY 3.0.</w:t>
       </w:r>
     </w:p>
     <w:p>
@@ -594,7 +594,7 @@
         <w:pStyle w:val="ListBullet"/>
       </w:pPr>
       <w:r>
-        <w:t>[Photographer] ([year]) [Title] [Photograph]. Available at: [URL] (Accessed: [date]). Used as: paper-bg.jpg</w:t>
+        <w:t>Bhullargraphic (2026) Vintage Imperial typewriter, The Good Companion, close up [Photograph]. Wikimedia Commons. Available at: https://commons.wikimedia.org/wiki/File:Vintage_Imperial_Typewriter_The_Good_Companion_Close_Up.jpg (Accessed: 15 October 2026). Licence: CC BY-SA 4.0.</w:t>
       </w:r>
     </w:p>
     <w:p>
@@ -602,7 +602,7 @@
         <w:pStyle w:val="ListBullet"/>
       </w:pPr>
       <w:r>
-        <w:t>[Photographer] ([year]) [Title] [Photograph]. Available at: [URL] (Accessed: [date]). Used as: record-player.jpg</w:t>
+        <w:t>Haupt, J. (2015) Vintage Yashica 35mm SLR film camera, model FX-2, made in Japan [Photograph]. Wikimedia Commons. Available at: https://commons.wikimedia.org/wiki/File:Vintage_Yashica_35mm_SLR_Film_Camera,_Model_FX-2,_Made_In_Japan_(16873299796).jpg (Accessed: 15 October 2026). Licence: CC BY-SA 2.0.</w:t>
       </w:r>
     </w:p>
     <w:p>
@@ -610,7 +610,7 @@
         <w:pStyle w:val="ListBullet"/>
       </w:pPr>
       <w:r>
-        <w:t>[Photographer] ([year]) [Title] [Photograph]. Available at: [URL] (Accessed: [date]). Used as: camera.jpg</w:t>
+        <w:t>PattayaPatrol (2026) A close-up of vintage trinkets and medals laid out on a market table with shoppers browsing in the background [Photograph]. Wikimedia Commons. Available at: https://commons.wikimedia.org/wiki/File:DFC_4364_A_close-up_of_vintage_trinkets_and_medals_laid_out_on_a_market_table_with_shoppers_browsing_in_the_background.jpg (Accessed: 15 October 2026). Licence: CC BY-SA 4.0.</w:t>
       </w:r>
     </w:p>
     <w:p>
@@ -618,15 +618,7 @@
         <w:pStyle w:val="ListBullet"/>
       </w:pPr>
       <w:r>
-        <w:t>[Photographer] ([year]) [Title] [Photograph]. Available at: [URL] (Accessed: [date]). Used as: typewriter.jpg</w:t>
-      </w:r>
-    </w:p>
-    <w:p>
-      <w:pPr>
-        <w:pStyle w:val="ListBullet"/>
-      </w:pPr>
-      <w:r>
-        <w:t>[Photographer] ([year]) [Title] [Photograph]. Available at: [URL] (Accessed: [date]). Used as: icon.png</w:t>
+        <w:t>The Digital Yard Sale (2009) Old paper 2 [Photograph]. Wikimedia Commons. Available at: https://commons.wikimedia.org/wiki/File:Old_paper2.jpg (Accessed: 15 October 2026). Licence: public domain.</w:t>
       </w:r>
     </w:p>
     <w:sectPr>

</xml_diff>

<commit_message>
Make the nav menu follow the site map as a nested list
Co-Authored-By: Claude Sonnet 5.5 <noreply@anthropic.com>
Claude-Session: https://claude.ai/code/session_01Dueem4NQ1jgAsupYtnRLLZ
</commit_message>
<xml_diff>
--- a/docs/Planning_Document_u3344415.docx
+++ b/docs/Planning_Document_u3344415.docx
@@ -30,7 +30,7 @@
     </w:p>
     <w:p>
       <w:r>
-        <w:t>The site map follows Figure 2 of the design specifications. Each box is one page. The menu inside the nav element of every page links to all six pages.</w:t>
+        <w:t>The site map follows Figure 2 of the design specifications. Each box is one page. The menu inside the nav element of every page is a nested list that follows this map, so every page is reachable from every other page.</w:t>
       </w:r>
     </w:p>
     <w:p>
@@ -430,7 +430,7 @@
     </w:p>
     <w:p>
       <w:r>
-        <w:t>My own design: header, a menu bar under the header, then main and footer.</w:t>
+        <w:t>My own design: header, the menu in a bar under the header, then main and footer.</w:t>
       </w:r>
     </w:p>
     <w:p>

</xml_diff>

<commit_message>
Simpler site map and wireframes in the Word document
Co-Authored-By: Claude Sonnet 5.5 <noreply@anthropic.com>
Claude-Session: https://claude.ai/code/session_01Dueem4NQ1jgAsupYtnRLLZ
</commit_message>
<xml_diff>
--- a/docs/Planning_Document_u3344415.docx
+++ b/docs/Planning_Document_u3344415.docx
@@ -4,10 +4,10 @@
   <w:body>
     <w:p>
       <w:pPr>
-        <w:pStyle w:val="Title"/>
+        <w:pStyle w:val="Heading1"/>
       </w:pPr>
       <w:r>
-        <w:t>Why We Love Vintage? - Website Planning Document</w:t>
+        <w:t>Why We Love Vintage? - Site map, wireframes and references</w:t>
       </w:r>
     </w:p>
     <w:p>
@@ -30,7 +30,7 @@
     </w:p>
     <w:p>
       <w:r>
-        <w:t>The site map follows Figure 2 of the design specifications. Each box is one page. The menu inside the nav element of every page is a nested list that follows this map, so every page is reachable from every other page.</w:t>
+        <w:t>This is the site map for my website. Each box is one page. The menu in the nav of every page follows this map.</w:t>
       </w:r>
     </w:p>
     <w:p>
@@ -77,7 +77,7 @@
         <w:jc w:val="center"/>
       </w:pPr>
       <w:r>
-        <w:t>Figure 1. Site map of the website.</w:t>
+        <w:t>Figure 1. Site map</w:t>
       </w:r>
     </w:p>
     <w:tbl>

</xml_diff>